<commit_message>
Docs: sweep sibling specs for the cross-ledger move (0114)
personal-ledger-spec (§5.1, §7 table, §16, related docs), family-tab-spec
(§11 table, related docs) and the personal-ledger feature doc stop claiming
personal photos are unwired and publish-out is unbuilt; the review spec's
one-way re-route row now points out it governs unseen sealed rows only,
with committed rows movable via cross-ledger-move-spec. Regenerated the
two touched .docx twins.

Co-Authored-By: Claude Fable 5 <noreply@anthropic.com>
</commit_message>
<xml_diff>
--- a/docs/specs/family-tab-spec.docx
+++ b/docs/specs/family-tab-spec.docx
@@ -2347,7 +2347,22 @@
               <w:rPr>
                 <w:sz w:val="19"/>
               </w:rPr>
-              <w:t>Not wired yet</w:t>
+              <w:t>Yes since 0114 — own bucket, personal-DEK encrypted (</w:t>
+            </w:r>
+            <w:r>
+              <w:rPr>
+                <w:rFonts w:ascii="Consolas" w:hAnsi="Consolas"/>
+                <w:b w:val="0"/>
+                <w:color w:val="2A4A3A"/>
+                <w:sz w:val="17"/>
+              </w:rPr>
+              <w:t>cross-ledger-move-spec.md</w:t>
+            </w:r>
+            <w:r>
+              <w:rPr>
+                <w:sz w:val="19"/>
+              </w:rPr>
+              <w:t xml:space="preserve"> §3)</w:t>
             </w:r>
           </w:p>
         </w:tc>
@@ -9861,6 +9876,24 @@
           <w:color w:val="2A4A3A"/>
           <w:sz w:val="20"/>
         </w:rPr>
+        <w:t>cross-ledger-move-spec.md</w:t>
+      </w:r>
+      <w:r>
+        <w:rPr/>
+        <w:t xml:space="preserve"> — moving a logged expense between this ledger and the personal book (0114).</w:t>
+      </w:r>
+    </w:p>
+    <w:p>
+      <w:pPr>
+        <w:pStyle w:val="ListBullet"/>
+      </w:pPr>
+      <w:r>
+        <w:rPr>
+          <w:rFonts w:ascii="Consolas" w:hAnsi="Consolas"/>
+          <w:b w:val="0"/>
+          <w:color w:val="2A4A3A"/>
+          <w:sz w:val="20"/>
+        </w:rPr>
         <w:t>bank-email-capture-spec.docx</w:t>
       </w:r>
       <w:r>

</xml_diff>